<commit_message>
docs: keep the logo with three lanes only (ADR 010)
The original logo's four lanes ran together at small sizes, so the app
already drew a reduced monogram of three; the four-lane files stayed
in docs/marca next to it and invited using the wrong one. They are
gone, and the brand script, which holds the original coordinates, is
now the source of truth: it draws every brand file from them, with
three lanes, straight into docs/marca, the stacked logo of the
original included. The brand guide describes three lanes, says why,
and shows the new files. The app's icons and geometry are unchanged.
</commit_message>
<xml_diff>
--- a/docs/marca/AllRun · Guía de marca.docx
+++ b/docs/marca/AllRun · Guía de marca.docx
@@ -13,13 +13,7 @@
     <w:p>
       <w:pPr/>
       <w:r>
-        <w:t xml:space="preserve">Oct 16, 2026</w:t>
-      </w:r>
-      <w:r>
-        <w:t xml:space="preserve"> · </w:t>
-      </w:r>
-      <w:r>
-        <w:t xml:space="preserve">@Pedro</w:t>
+        <w:t xml:space="preserve">Oct 16, 2026 · @Pedro</w:t>
       </w:r>
     </w:p>
     <w:p>
@@ -33,7 +27,7 @@
     <w:p>
       <w:pPr/>
       <w:r>
-        <w:t xml:space="preserve">AllRun es una app de running y su identidad nace de un solo objeto: la pista de atletismo. El logo une las iniciales A y R con una pista de 4 calles, y la paleta copia los colores de una pista real: tartán rojo, líneas blancas y un azul noche que da peso y contraste.</w:t>
+        <w:t xml:space="preserve">AllRun es una app de running y su identidad nace de un solo objeto: la pista de atletismo. El logo une las iniciales A y R con una pista de 3 calles, y la paleta copia los colores de una pista real: tartán rojo, líneas blancas y un azul noche que da peso y contraste.</w:t>
       </w:r>
     </w:p>
     <w:p>
@@ -83,7 +77,7 @@
     <w:p>
       <w:pPr/>
       <w:r>
-        <w:t xml:space="preserve">El monograma AR dibuja la R como una curva de pista de 4 calles que atraviesa la A, de modo que las calles hacen también de travesaño de la A.</w:t>
+        <w:t xml:space="preserve">El monograma AR dibuja la R como una curva de pista de 3 calles que atraviesa la A, de modo que las calles hacen también de travesaño de la A.</w:t>
       </w:r>
     </w:p>
     <w:p>
@@ -101,7 +95,7 @@
         <w:t xml:space="preserve">La pista.</w:t>
       </w:r>
       <w:r>
-        <w:t xml:space="preserve"> Cuatro calles separadas por líneas blancas, como en una pista real. La calle sale del palo vertical, gira en la curva de la R y vuelve recta hasta cortarse en el borde de la A: la pista queda contenida dentro de la letra.</w:t>
+        <w:t xml:space="preserve"> Tres calles separadas por líneas blancas, como en una pista real. La calle sale del palo vertical, gira en la curva de la R y vuelve recta hasta cortarse en el borde de la A: la pista queda contenida dentro de la letra. El primer diseño tenía cuatro calles; se quedó en tres porque, en tamaños pequeños (el icono de la app, las marcas de agua), cuatro líneas se empastaban.</w:t>
       </w:r>
     </w:p>
     <w:p>
@@ -861,7 +855,7 @@
               <w:rPr>
                 <w:rStyle w:val="CodeChar"/>
               </w:rPr>
-              <w:t xml:space="preserve">allrun-logo.svg</w:t>
+              <w:t xml:space="preserve">allrun-logo-stacked-color.svg</w:t>
             </w:r>
             <w:r>
               <w:t xml:space="preserve"> / </w:t>
@@ -908,7 +902,7 @@
               <w:rPr>
                 <w:rStyle w:val="CodeChar"/>
               </w:rPr>
-              <w:t xml:space="preserve">allrun-icon-1024.png</w:t>
+              <w:t xml:space="preserve">allrun-icon.png</w:t>
             </w:r>
             <w:r>
               <w:t xml:space="preserve"> / </w:t>
@@ -955,7 +949,7 @@
               <w:rPr>
                 <w:rStyle w:val="CodeChar"/>
               </w:rPr>
-              <w:t xml:space="preserve">allrun-logo-black.svg</w:t>
+              <w:t xml:space="preserve">allrun-logo-stacked-black.svg</w:t>
             </w:r>
             <w:r>
               <w:t xml:space="preserve"> / </w:t>
@@ -1002,7 +996,7 @@
               <w:rPr>
                 <w:rStyle w:val="CodeChar"/>
               </w:rPr>
-              <w:t xml:space="preserve">allrun-logo-white.svg</w:t>
+              <w:t xml:space="preserve">allrun-logo-stacked-white.svg</w:t>
             </w:r>
             <w:r>
               <w:t xml:space="preserve"> / </w:t>
@@ -1031,7 +1025,7 @@
     <w:p>
       <w:pPr/>
       <w:r>
-        <w:t xml:space="preserve">En las versiones negra y blanca las líneas de las calles son huecos transparentes, así que dejan ver el fondo. Por debajo de unos 48 px las líneas se pierden: para favicon hará falta una versión simplificada.</w:t>
+        <w:t xml:space="preserve">En las versiones negra y blanca las líneas de las calles son huecos transparentes, así que dejan ver el fondo. Con tres calles, las líneas siguen viéndose en tamaños pequeños, hasta el favicon de 48 px. Junto a estas versiones, en docs/marca están también el logo horizontal (allrun-logo-horizontal-*, también sobre fondo oscuro), el monograma solo (allrun-mark-*) y el nombre solo (allrun-wordmark-*), en color, blanco y negro. Todos salen de npm run brand.</w:t>
       </w:r>
     </w:p>
     <w:p>

</xml_diff>